<commit_message>
PROFILES LOT 5 : audits et liste Word ; contrôle des extraits renforcé
Le contrôle des extraits tolère le découpage des mots par les balises Google Docs.

Co-Authored-By: Claude Opus 5.5 <noreply@anthropic.com>
Claude-Session: https://claude.ai/code/session_01AWXfY7j2w4cSqh3Dhwkmiv
</commit_message>
<xml_diff>
--- a/claude/LOT Organigramme/LOT_1_Liste_Corrections_Audit.docx
+++ b/claude/LOT Organigramme/LOT_1_Liste_Corrections_Audit.docx
@@ -9182,7 +9182,7 @@
                 <w:sz w:val="17"/>
                 <w:szCs w:val="17"/>
               </w:rPr>
-              <w:t xml:space="preserve">Fichier entier (extrait à rechercher par mots-clés : citation non littérale)</w:t>
+              <w:t xml:space="preserve">Fichier entier</w:t>
             </w:r>
           </w:p>
         </w:tc>
@@ -9366,7 +9366,7 @@
                 <w:sz w:val="17"/>
                 <w:szCs w:val="17"/>
               </w:rPr>
-              <w:t xml:space="preserve">Fichier entier (extrait à rechercher par mots-clés : citation non littérale)</w:t>
+              <w:t xml:space="preserve">Fichier entier</w:t>
             </w:r>
           </w:p>
         </w:tc>
@@ -9550,7 +9550,7 @@
                 <w:sz w:val="17"/>
                 <w:szCs w:val="17"/>
               </w:rPr>
-              <w:t xml:space="preserve">Fichier entier (extrait à rechercher par mots-clés : citation non littérale)</w:t>
+              <w:t xml:space="preserve">Fichier entier</w:t>
             </w:r>
           </w:p>
         </w:tc>
@@ -9734,7 +9734,7 @@
                 <w:sz w:val="17"/>
                 <w:szCs w:val="17"/>
               </w:rPr>
-              <w:t xml:space="preserve">Fichier entier (extrait à rechercher par mots-clés : citation non littérale)</w:t>
+              <w:t xml:space="preserve">Fichier entier</w:t>
             </w:r>
           </w:p>
         </w:tc>
@@ -9918,7 +9918,7 @@
                 <w:sz w:val="17"/>
                 <w:szCs w:val="17"/>
               </w:rPr>
-              <w:t xml:space="preserve">Fichier entier (extrait à rechercher par mots-clés : citation non littérale)</w:t>
+              <w:t xml:space="preserve">Fichier entier</w:t>
             </w:r>
           </w:p>
         </w:tc>
@@ -10102,7 +10102,7 @@
                 <w:sz w:val="17"/>
                 <w:szCs w:val="17"/>
               </w:rPr>
-              <w:t xml:space="preserve">Fichier entier (extrait à rechercher par mots-clés : citation non littérale)</w:t>
+              <w:t xml:space="preserve">Fichier entier</w:t>
             </w:r>
           </w:p>
         </w:tc>
@@ -10286,7 +10286,7 @@
                 <w:sz w:val="17"/>
                 <w:szCs w:val="17"/>
               </w:rPr>
-              <w:t xml:space="preserve">Fichier entier (extrait à rechercher par mots-clés : citation non littérale)</w:t>
+              <w:t xml:space="preserve">Fichier entier</w:t>
             </w:r>
           </w:p>
         </w:tc>
@@ -20998,7 +20998,7 @@
                 <w:sz w:val="17"/>
                 <w:szCs w:val="17"/>
               </w:rPr>
-              <w:t xml:space="preserve">Bloc 1 › point 8 Diagnostic positif (extrait à rechercher par mots-clés : citation non littérale)</w:t>
+              <w:t xml:space="preserve">Bloc 1 › point 8 Diagnostic positif</w:t>
             </w:r>
           </w:p>
         </w:tc>
@@ -21182,7 +21182,7 @@
                 <w:sz w:val="17"/>
                 <w:szCs w:val="17"/>
               </w:rPr>
-              <w:t xml:space="preserve">D1.1 › point 11.B › 1re intention (2 occurrences, aussi dans le fichier V4 Expert Complet, D1.1 › 11.B : « SweatStop®, Odaban® ») (extrait à rechercher par mots-clés : citation non littérale)</w:t>
+              <w:t xml:space="preserve">D1.1 › point 11.B › 1re intention (2 occurrences, aussi dans le fichier V4 Expert Complet, D1.1 › 11.B : « SweatStop®, Odaban® »)</w:t>
             </w:r>
           </w:p>
         </w:tc>
@@ -21366,7 +21366,7 @@
                 <w:sz w:val="17"/>
                 <w:szCs w:val="17"/>
               </w:rPr>
-              <w:t xml:space="preserve">D1.1 › point 11.B › 3e ligne systémique (aussi fichier V4 Expert Complet, D1.4 › 11.B, « Ditropan® 2,5 mg/j ») (extrait à rechercher par mots-clés : citation non littérale)</w:t>
+              <w:t xml:space="preserve">D1.1 › point 11.B › 3e ligne systémique (aussi fichier V4 Expert Complet, D1.4 › 11.B, « Ditropan® 2,5 mg/j »)</w:t>
             </w:r>
           </w:p>
         </w:tc>
@@ -21550,7 +21550,7 @@
                 <w:sz w:val="17"/>
                 <w:szCs w:val="17"/>
               </w:rPr>
-              <w:t xml:space="preserve">D1.1 › point 11.D Pronostic et recherche (extrait à rechercher par mots-clés : citation non littérale)</w:t>
+              <w:t xml:space="preserve">D1.1 › point 11.D Pronostic et recherche</w:t>
             </w:r>
           </w:p>
         </w:tc>

</xml_diff>